<commit_message>
Add session isolation mechanism for plan steps (CLAUDE.md §16.5)
Moi buoc trong plan gio chay tach khoi session chinh: LOCAL dung Agent
subagent, WEB dung RemoteTrigger - agent/trigger tu commit+push+cap nhat
plan file (kem thoi gian hoan thanh), tranh session chinh phinh to.

Co-Authored-By: Claude Sonnet 5 <noreply@anthropic.com>
</commit_message>
<xml_diff>
--- a/.claude/agents/task-planner.docx
+++ b/.claude/agents/task-planner.docx
@@ -368,7 +368,343 @@
           <w:color w:val="F05922"/>
           <w:sz w:val="28"/>
         </w:rPr>
-        <w:t>Cập nhật sau mỗi bước</w:t>
+        <w:t>Thực hiện từng bước — BẮT BUỘC tách session (xem CLAUDE.md §16.5)</w:t>
+      </w:r>
+    </w:p>
+    <w:p>
+      <w:pPr>
+        <w:spacing w:after="80"/>
+      </w:pPr>
+      <w:r>
+        <w:rPr>
+          <w:sz w:val="21"/>
+        </w:rPr>
+        <w:t>KHÔNG tự thực hiện bước hoặc gọi agent thực thi trong session hiện tại. Với mỗi bước ⬜/🔄 kế tiếp:</w:t>
+      </w:r>
+    </w:p>
+    <w:p>
+      <w:pPr>
+        <w:spacing w:after="20"/>
+        <w:ind w:left="567" w:hanging="283"/>
+      </w:pPr>
+      <w:r>
+        <w:rPr>
+          <w:sz w:val="21"/>
+        </w:rPr>
+        <w:t>1.</w:t>
+        <w:tab/>
+      </w:r>
+      <w:r>
+        <w:rPr>
+          <w:b/>
+          <w:sz w:val="21"/>
+        </w:rPr>
+        <w:t>Xác định môi trường</w:t>
+      </w:r>
+      <w:r>
+        <w:rPr>
+          <w:sz w:val="21"/>
+        </w:rPr>
+        <w:t xml:space="preserve"> (1 lần/plan): system prompt có "VSCode Extension Context" hoặc working dir local (</w:t>
+      </w:r>
+      <w:r>
+        <w:rPr>
+          <w:rFonts w:ascii="Courier New" w:hAnsi="Courier New"/>
+          <w:color w:val="F05922"/>
+          <w:sz w:val="21"/>
+        </w:rPr>
+        <w:t>C:\Users\...</w:t>
+      </w:r>
+      <w:r>
+        <w:rPr>
+          <w:sz w:val="21"/>
+        </w:rPr>
+        <w:t xml:space="preserve">) → </w:t>
+      </w:r>
+      <w:r>
+        <w:rPr>
+          <w:b/>
+          <w:sz w:val="21"/>
+        </w:rPr>
+        <w:t>LOCAL</w:t>
+      </w:r>
+      <w:r>
+        <w:rPr>
+          <w:sz w:val="21"/>
+        </w:rPr>
+        <w:t xml:space="preserve">. Không có, chạy sandbox cloud → </w:t>
+      </w:r>
+      <w:r>
+        <w:rPr>
+          <w:b/>
+          <w:sz w:val="21"/>
+        </w:rPr>
+        <w:t>WEB</w:t>
+      </w:r>
+      <w:r>
+        <w:rPr>
+          <w:sz w:val="21"/>
+        </w:rPr>
+        <w:t>. Không chắc → hỏi user.</w:t>
+      </w:r>
+    </w:p>
+    <w:p>
+      <w:pPr>
+        <w:spacing w:after="20"/>
+        <w:ind w:left="567" w:hanging="283"/>
+      </w:pPr>
+      <w:r>
+        <w:rPr>
+          <w:sz w:val="21"/>
+        </w:rPr>
+        <w:t>2.</w:t>
+        <w:tab/>
+      </w:r>
+      <w:r>
+        <w:rPr>
+          <w:b/>
+          <w:sz w:val="21"/>
+        </w:rPr>
+        <w:t>LOCAL</w:t>
+      </w:r>
+      <w:r>
+        <w:rPr>
+          <w:sz w:val="21"/>
+        </w:rPr>
+        <w:t xml:space="preserve"> → gọi </w:t>
+      </w:r>
+      <w:r>
+        <w:rPr>
+          <w:rFonts w:ascii="Courier New" w:hAnsi="Courier New"/>
+          <w:color w:val="F05922"/>
+          <w:sz w:val="21"/>
+        </w:rPr>
+        <w:t>Agent</w:t>
+      </w:r>
+      <w:r>
+        <w:rPr>
+          <w:sz w:val="21"/>
+        </w:rPr>
+        <w:t xml:space="preserve"> (subagent_type = agent phụ trách bước, prompt tự chứa đủ context: mô tả bước + đường dẫn plan file + artifact mong đợi).</w:t>
+      </w:r>
+    </w:p>
+    <w:p>
+      <w:pPr>
+        <w:spacing w:after="20"/>
+        <w:ind w:left="567" w:hanging="283"/>
+      </w:pPr>
+      <w:r>
+        <w:rPr>
+          <w:sz w:val="21"/>
+        </w:rPr>
+        <w:t>3.</w:t>
+        <w:tab/>
+      </w:r>
+      <w:r>
+        <w:rPr>
+          <w:b/>
+          <w:sz w:val="21"/>
+        </w:rPr>
+        <w:t>WEB</w:t>
+      </w:r>
+      <w:r>
+        <w:rPr>
+          <w:sz w:val="21"/>
+        </w:rPr>
+        <w:t xml:space="preserve"> → gọi </w:t>
+      </w:r>
+      <w:r>
+        <w:rPr>
+          <w:rFonts w:ascii="Courier New" w:hAnsi="Courier New"/>
+          <w:color w:val="F05922"/>
+          <w:sz w:val="21"/>
+        </w:rPr>
+        <w:t>RemoteTrigger</w:t>
+      </w:r>
+      <w:r>
+        <w:rPr>
+          <w:sz w:val="21"/>
+        </w:rPr>
+        <w:t xml:space="preserve"> (</w:t>
+      </w:r>
+      <w:r>
+        <w:rPr>
+          <w:rFonts w:ascii="Courier New" w:hAnsi="Courier New"/>
+          <w:color w:val="F05922"/>
+          <w:sz w:val="21"/>
+        </w:rPr>
+        <w:t>create</w:t>
+      </w:r>
+      <w:r>
+        <w:rPr>
+          <w:sz w:val="21"/>
+        </w:rPr>
+        <w:t xml:space="preserve"> lần đầu, </w:t>
+      </w:r>
+      <w:r>
+        <w:rPr>
+          <w:rFonts w:ascii="Courier New" w:hAnsi="Courier New"/>
+          <w:color w:val="F05922"/>
+          <w:sz w:val="21"/>
+        </w:rPr>
+        <w:t>run</w:t>
+      </w:r>
+      <w:r>
+        <w:rPr>
+          <w:sz w:val="21"/>
+        </w:rPr>
+        <w:t xml:space="preserve"> các lần sau) với body tương đương nội dung ở bước 2.</w:t>
+      </w:r>
+    </w:p>
+    <w:p>
+      <w:pPr>
+        <w:spacing w:after="20"/>
+        <w:ind w:left="567" w:hanging="283"/>
+      </w:pPr>
+      <w:r>
+        <w:rPr>
+          <w:sz w:val="21"/>
+        </w:rPr>
+        <w:t>4.</w:t>
+        <w:tab/>
+      </w:r>
+      <w:r>
+        <w:rPr>
+          <w:sz w:val="21"/>
+        </w:rPr>
+        <w:t xml:space="preserve">Agent/trigger đó tự chịu trách nhiệm: </w:t>
+      </w:r>
+      <w:r>
+        <w:rPr>
+          <w:rFonts w:ascii="Courier New" w:hAnsi="Courier New"/>
+          <w:color w:val="F05922"/>
+          <w:sz w:val="21"/>
+        </w:rPr>
+        <w:t>git commit</w:t>
+      </w:r>
+      <w:r>
+        <w:rPr>
+          <w:sz w:val="21"/>
+        </w:rPr>
+        <w:t xml:space="preserve"> (format ở CLAUDE.md §16.5 Bước 3) + </w:t>
+      </w:r>
+      <w:r>
+        <w:rPr>
+          <w:rFonts w:ascii="Courier New" w:hAnsi="Courier New"/>
+          <w:color w:val="F05922"/>
+          <w:sz w:val="21"/>
+        </w:rPr>
+        <w:t>git push</w:t>
+      </w:r>
+      <w:r>
+        <w:rPr>
+          <w:sz w:val="21"/>
+        </w:rPr>
+        <w:t xml:space="preserve"> + </w:t>
+      </w:r>
+      <w:r>
+        <w:rPr>
+          <w:rFonts w:ascii="Courier New" w:hAnsi="Courier New"/>
+          <w:color w:val="F05922"/>
+          <w:sz w:val="21"/>
+        </w:rPr>
+        <w:t>Edit</w:t>
+      </w:r>
+      <w:r>
+        <w:rPr>
+          <w:sz w:val="21"/>
+        </w:rPr>
+        <w:t xml:space="preserve"> plan file (⬜/🔄→✅, artifact, </w:t>
+      </w:r>
+      <w:r>
+        <w:rPr>
+          <w:b/>
+          <w:sz w:val="21"/>
+        </w:rPr>
+        <w:t>thời gian hoàn thành thực tế</w:t>
+      </w:r>
+      <w:r>
+        <w:rPr>
+          <w:sz w:val="21"/>
+        </w:rPr>
+        <w:t>).</w:t>
+      </w:r>
+    </w:p>
+    <w:p>
+      <w:pPr>
+        <w:spacing w:after="20"/>
+        <w:ind w:left="567" w:hanging="283"/>
+      </w:pPr>
+      <w:r>
+        <w:rPr>
+          <w:sz w:val="21"/>
+        </w:rPr>
+        <w:t>5.</w:t>
+        <w:tab/>
+      </w:r>
+      <w:r>
+        <w:rPr>
+          <w:sz w:val="21"/>
+        </w:rPr>
+        <w:t>Nhận tóm tắt ngắn (≤5 dòng) trả về — KHÔNG kéo log chi tiết vào session chính.</w:t>
+      </w:r>
+    </w:p>
+    <w:p>
+      <w:pPr>
+        <w:spacing w:after="20"/>
+        <w:ind w:left="567" w:hanging="283"/>
+      </w:pPr>
+      <w:r>
+        <w:rPr>
+          <w:sz w:val="21"/>
+        </w:rPr>
+        <w:t>6.</w:t>
+        <w:tab/>
+      </w:r>
+      <w:r>
+        <w:rPr>
+          <w:rFonts w:ascii="Courier New" w:hAnsi="Courier New"/>
+          <w:color w:val="F05922"/>
+          <w:sz w:val="21"/>
+        </w:rPr>
+        <w:t>Read</w:t>
+      </w:r>
+      <w:r>
+        <w:rPr>
+          <w:sz w:val="21"/>
+        </w:rPr>
+        <w:t xml:space="preserve"> lại plan file để xác nhận bước đã ✅ trước khi giao bước kế tiếp — không tự đoán trạng thái.</w:t>
+      </w:r>
+    </w:p>
+    <w:p>
+      <w:pPr>
+        <w:spacing w:after="80"/>
+      </w:pPr>
+      <w:r>
+        <w:rPr>
+          <w:b/>
+          <w:sz w:val="21"/>
+        </w:rPr>
+        <w:t>Ngoại lệ bỏ session isolation:</w:t>
+      </w:r>
+      <w:r>
+        <w:rPr>
+          <w:sz w:val="21"/>
+        </w:rPr>
+        <w:t xml:space="preserve"> plan chỉ 1 bước, bước là câu hỏi/xác nhận, hoặc user yêu cầu rõ chạy 1 session.</w:t>
+      </w:r>
+    </w:p>
+    <w:p>
+      <w:pPr>
+        <w:pStyle w:val="Heading2"/>
+        <w:spacing w:before="200" w:after="80"/>
+      </w:pPr>
+      <w:r>
+        <w:rPr>
+          <w:color w:val="F05922"/>
+          <w:sz w:val="28"/>
+        </w:rPr>
+        <w:t>Cập nhật sau mỗi bước (khi Dispatcher tự cập nhật, không qua subagent)</w:t>
       </w:r>
     </w:p>
     <w:p>
@@ -393,7 +729,7 @@
         <w:rPr>
           <w:sz w:val="21"/>
         </w:rPr>
-        <w:t xml:space="preserve">: ⬜→✅, điền artifact, cập nhật </w:t>
+        <w:t xml:space="preserve">: ⬜→✅, điền artifact, điền thời gian hoàn thành, cập nhật </w:t>
       </w:r>
       <w:r>
         <w:rPr>

</xml_diff>

<commit_message>
Add Handoff Log to plan session isolation (CLAUDE.md §16.5 Buoc 4)
Moi buoc hoan thanh phai ghi tom tat (da lam gi, quyet dinh, canh bao)
vao muc Handoff Log trong plan file. Buoc ke tiep duoc nhung nguyen van
muc nay vao prompt, tranh phai doc lai/nghien cuu lai dieu buoc truoc
da xac dinh.

Co-Authored-By: Claude Sonnet 5 <noreply@anthropic.com>
</commit_message>
<xml_diff>
--- a/.claude/agents/task-planner.docx
+++ b/.claude/agents/task-planner.docx
@@ -627,7 +627,20 @@
         <w:rPr>
           <w:sz w:val="21"/>
         </w:rPr>
-        <w:t>).</w:t>
+        <w:t xml:space="preserve">, + entry mới vào </w:t>
+      </w:r>
+      <w:r>
+        <w:rPr>
+          <w:b/>
+          <w:sz w:val="21"/>
+        </w:rPr>
+        <w:t>Handoff Log</w:t>
+      </w:r>
+      <w:r>
+        <w:rPr>
+          <w:sz w:val="21"/>
+        </w:rPr>
+        <w:t xml:space="preserve"> — format CLAUDE.md §16.5 Bước 4).</w:t>
       </w:r>
     </w:p>
     <w:p>
@@ -674,6 +687,60 @@
           <w:sz w:val="21"/>
         </w:rPr>
         <w:t xml:space="preserve"> lại plan file để xác nhận bước đã ✅ trước khi giao bước kế tiếp — không tự đoán trạng thái.</w:t>
+      </w:r>
+    </w:p>
+    <w:p>
+      <w:pPr>
+        <w:spacing w:after="20"/>
+        <w:ind w:left="567" w:hanging="283"/>
+      </w:pPr>
+      <w:r>
+        <w:rPr>
+          <w:sz w:val="21"/>
+        </w:rPr>
+        <w:t>7.</w:t>
+        <w:tab/>
+      </w:r>
+      <w:r>
+        <w:rPr>
+          <w:b/>
+          <w:sz w:val="21"/>
+        </w:rPr>
+        <w:t>Trước khi giao bước kế tiếp:</w:t>
+      </w:r>
+      <w:r>
+        <w:rPr>
+          <w:sz w:val="21"/>
+        </w:rPr>
+        <w:t xml:space="preserve"> lấy toàn bộ nội dung "## Handoff Log" hiện có trong plan file, nhúng nguyên văn vào đầu prompt của </w:t>
+      </w:r>
+      <w:r>
+        <w:rPr>
+          <w:rFonts w:ascii="Courier New" w:hAnsi="Courier New"/>
+          <w:color w:val="F05922"/>
+          <w:sz w:val="21"/>
+        </w:rPr>
+        <w:t>Agent</w:t>
+      </w:r>
+      <w:r>
+        <w:rPr>
+          <w:sz w:val="21"/>
+        </w:rPr>
+        <w:t>/</w:t>
+      </w:r>
+      <w:r>
+        <w:rPr>
+          <w:rFonts w:ascii="Courier New" w:hAnsi="Courier New"/>
+          <w:color w:val="F05922"/>
+          <w:sz w:val="21"/>
+        </w:rPr>
+        <w:t>RemoteTrigger</w:t>
+      </w:r>
+      <w:r>
+        <w:rPr>
+          <w:sz w:val="21"/>
+        </w:rPr>
+        <w:t xml:space="preserve"> bước kế tiếp — để agent đó KHÔNG phải tự đọc lại/nghiên cứu lại những gì bước trước đã xác định.</w:t>
       </w:r>
     </w:p>
     <w:p>

</xml_diff>

<commit_message>
task-planner: bat buoc check UXR + real-app QA doc lap voi rut gon workflow
Phat hien qua test TodoApp (nhanh feat/session-isolation): plan rut gon
WF-FEATURE da bo qua UX/UI Reviewer du co them UI moi, va QA thay
"chay app thuc" bang unit test/code-review ma khong bao. Them checklist
buoc 3.5 de task-planner luon danh gia UXR/real-app doc lap voi viec
rut gon cac buoc khac.

Co-Authored-By: Claude Sonnet 5 <noreply@anthropic.com>
</commit_message>
<xml_diff>
--- a/.claude/agents/task-planner.docx
+++ b/.claude/agents/task-planner.docx
@@ -174,6 +174,63 @@
           <w:sz w:val="21"/>
         </w:rPr>
         <w:t>Phân tích: workflow ID, phases, agent chain</w:t>
+      </w:r>
+    </w:p>
+    <w:p>
+      <w:pPr>
+        <w:spacing w:after="80"/>
+      </w:pPr>
+      <w:r>
+        <w:rPr>
+          <w:sz w:val="21"/>
+        </w:rPr>
+        <w:t xml:space="preserve">3.5. </w:t>
+      </w:r>
+      <w:r>
+        <w:rPr>
+          <w:b/>
+          <w:sz w:val="21"/>
+        </w:rPr>
+        <w:t>BẮT BUỘC — kiểm tra độc lập, dù có "rút gọn" workflow:</w:t>
+      </w:r>
+    </w:p>
+    <w:p>
+      <w:pPr>
+        <w:pStyle w:val="ListBullet"/>
+        <w:spacing w:after="20"/>
+        <w:ind w:left="567"/>
+      </w:pPr>
+      <w:r>
+        <w:rPr>
+          <w:sz w:val="21"/>
+        </w:rPr>
+        <w:t xml:space="preserve">Task có tạo/sửa/thêm UI (form, screen, component hiển thị)? → PHẢI có bước </w:t>
+      </w:r>
+      <w:r>
+        <w:rPr>
+          <w:b/>
+          <w:sz w:val="21"/>
+        </w:rPr>
+        <w:t>UX/UI Reviewer</w:t>
+      </w:r>
+      <w:r>
+        <w:rPr>
+          <w:sz w:val="21"/>
+        </w:rPr>
+        <w:t xml:space="preserve"> trong agent chain (chạy app thật + screenshot + đánh giá C1–C7), đặt sau code review, trước QA sign-off. KHÔNG được bỏ chỉ vì đang rút gọn các bước khác (PM/BA/EM...) — điều kiện bỏ UXR CHỈ là "không đụng UI", không liên quan gì đến việc rút gọn agent chain.</w:t>
+      </w:r>
+    </w:p>
+    <w:p>
+      <w:pPr>
+        <w:pStyle w:val="ListBullet"/>
+        <w:spacing w:after="20"/>
+        <w:ind w:left="567"/>
+      </w:pPr>
+      <w:r>
+        <w:rPr>
+          <w:sz w:val="21"/>
+        </w:rPr>
+        <w:t>Task có bước QA/smoke test? → Bước đó PHẢI ghi rõ yêu cầu "chạy app thật" nếu plan gốc yêu cầu — xem CLAUDE.md/qa-engineer.md §Quy tắc real-app.</w:t>
       </w:r>
     </w:p>
     <w:p>

</xml_diff>